<commit_message>
docs: mark which recording scripts are recorded by people
Co-Authored-By: Claude Opus 5.5 <noreply@anthropic.com>
</commit_message>
<xml_diff>
--- a/docs/recording-scripts.docx
+++ b/docs/recording-scripts.docx
@@ -125,6 +125,8 @@
         <w:t>Second annotator: label the languages of S02, S11 and S20 a second time, blind (step 8 of the annotation guide). These were chosen now, before anyone knows which clips are hard, and they cover Hindi, code-mixed and noisy speech.</w:t>
       </w:r>
     </w:p>
+    <w:p/>
+    <w:p/>
     <w:tbl>
       <w:tblPr>
         <w:tblStyle w:val="TableGrid"/>
@@ -159,6 +161,7 @@
                 <w:b/>
                 <w:sz w:val="19"/>
               </w:rPr>
+              <w:lastRenderedPageBreak/>
               <w:t>ID</w:t>
             </w:r>
           </w:p>
@@ -472,7 +475,6 @@
               <w:rPr>
                 <w:sz w:val="19"/>
               </w:rPr>
-              <w:lastRenderedPageBreak/>
               <w:t>S03</w:t>
             </w:r>
           </w:p>
@@ -2047,6 +2049,7 @@
             <w:r>
               <w:rPr>
                 <w:sz w:val="19"/>
+                <w:highlight w:val="green"/>
               </w:rPr>
               <w:t>S18</w:t>
             </w:r>
@@ -2164,10 +2167,14 @@
           <w:p>
             <w:pPr>
               <w:spacing w:after="20"/>
-            </w:pPr>
-            <w:r>
-              <w:rPr>
-                <w:sz w:val="19"/>
+              <w:rPr>
+                <w:highlight w:val="green"/>
+              </w:rPr>
+            </w:pPr>
+            <w:r>
+              <w:rPr>
+                <w:sz w:val="19"/>
+                <w:highlight w:val="green"/>
               </w:rPr>
               <w:t>S19</w:t>
             </w:r>
@@ -2265,10 +2272,14 @@
           <w:p>
             <w:pPr>
               <w:spacing w:after="20"/>
-            </w:pPr>
-            <w:r>
-              <w:rPr>
-                <w:sz w:val="19"/>
+              <w:rPr>
+                <w:highlight w:val="green"/>
+              </w:rPr>
+            </w:pPr>
+            <w:r>
+              <w:rPr>
+                <w:sz w:val="19"/>
+                <w:highlight w:val="green"/>
               </w:rPr>
               <w:t>S20</w:t>
             </w:r>
@@ -2487,10 +2498,14 @@
           <w:p>
             <w:pPr>
               <w:spacing w:after="20"/>
-            </w:pPr>
-            <w:r>
-              <w:rPr>
-                <w:sz w:val="19"/>
+              <w:rPr>
+                <w:highlight w:val="green"/>
+              </w:rPr>
+            </w:pPr>
+            <w:r>
+              <w:rPr>
+                <w:sz w:val="19"/>
+                <w:highlight w:val="green"/>
               </w:rPr>
               <w:t>S22</w:t>
             </w:r>
@@ -2588,10 +2603,14 @@
           <w:p>
             <w:pPr>
               <w:spacing w:after="20"/>
-            </w:pPr>
-            <w:r>
-              <w:rPr>
-                <w:sz w:val="19"/>
+              <w:rPr>
+                <w:highlight w:val="green"/>
+              </w:rPr>
+            </w:pPr>
+            <w:r>
+              <w:rPr>
+                <w:sz w:val="19"/>
+                <w:highlight w:val="green"/>
               </w:rPr>
               <w:t>S23</w:t>
             </w:r>
@@ -2689,10 +2708,14 @@
           <w:p>
             <w:pPr>
               <w:spacing w:after="20"/>
-            </w:pPr>
-            <w:r>
-              <w:rPr>
-                <w:sz w:val="19"/>
+              <w:rPr>
+                <w:highlight w:val="green"/>
+              </w:rPr>
+            </w:pPr>
+            <w:r>
+              <w:rPr>
+                <w:sz w:val="19"/>
+                <w:highlight w:val="green"/>
               </w:rPr>
               <w:t>S24</w:t>
             </w:r>
@@ -2790,10 +2813,14 @@
           <w:p>
             <w:pPr>
               <w:spacing w:after="20"/>
-            </w:pPr>
-            <w:r>
-              <w:rPr>
-                <w:sz w:val="19"/>
+              <w:rPr>
+                <w:highlight w:val="green"/>
+              </w:rPr>
+            </w:pPr>
+            <w:r>
+              <w:rPr>
+                <w:sz w:val="19"/>
+                <w:highlight w:val="green"/>
               </w:rPr>
               <w:t>T01</w:t>
             </w:r>
@@ -2891,10 +2918,14 @@
           <w:p>
             <w:pPr>
               <w:spacing w:after="20"/>
-            </w:pPr>
-            <w:r>
-              <w:rPr>
-                <w:sz w:val="19"/>
+              <w:rPr>
+                <w:highlight w:val="green"/>
+              </w:rPr>
+            </w:pPr>
+            <w:r>
+              <w:rPr>
+                <w:sz w:val="19"/>
+                <w:highlight w:val="green"/>
               </w:rPr>
               <w:t>T02</w:t>
             </w:r>
@@ -2992,10 +3023,14 @@
           <w:p>
             <w:pPr>
               <w:spacing w:after="20"/>
-            </w:pPr>
-            <w:r>
-              <w:rPr>
-                <w:sz w:val="19"/>
+              <w:rPr>
+                <w:highlight w:val="green"/>
+              </w:rPr>
+            </w:pPr>
+            <w:r>
+              <w:rPr>
+                <w:sz w:val="19"/>
+                <w:highlight w:val="green"/>
               </w:rPr>
               <w:t>T03</w:t>
             </w:r>
@@ -3113,6 +3148,9 @@
           <w:p>
             <w:pPr>
               <w:spacing w:after="20"/>
+              <w:rPr>
+                <w:highlight w:val="green"/>
+              </w:rPr>
             </w:pPr>
             <w:r>
               <w:rPr>
@@ -3605,7 +3643,14 @@
               <w:rPr>
                 <w:sz w:val="19"/>
               </w:rPr>
-              <w:t>Language ID at the Code-Mixed boundary</w:t>
+              <w:t xml:space="preserve">Language ID at the Code-Mixed </w:t>
+            </w:r>
+            <w:r>
+              <w:rPr>
+                <w:sz w:val="19"/>
+              </w:rPr>
+              <w:lastRenderedPageBreak/>
+              <w:t>boundary</w:t>
             </w:r>
           </w:p>
         </w:tc>
@@ -3621,6 +3666,7 @@
               <w:rPr>
                 <w:sz w:val="19"/>
               </w:rPr>
+              <w:lastRenderedPageBreak/>
               <w:t>S08</w:t>
             </w:r>
           </w:p>
@@ -3689,7 +3735,6 @@
               <w:rPr>
                 <w:sz w:val="19"/>
               </w:rPr>
-              <w:lastRenderedPageBreak/>
               <w:t>Numbers, money, dates, acronyms</w:t>
             </w:r>
           </w:p>

</xml_diff>